<commit_message>
Booklet: ID line in every page header; header and footer 7 mm from the edge
Co-Authored-By: Claude Opus 5.5 <noreply@anthropic.com>
</commit_message>
<xml_diff>
--- a/חומר פתוח - מנהיגות בניהול.docx
+++ b/חומר פתוח - מנהיגות בניהול.docx
@@ -2265,7 +2265,7 @@
           <w:headerReference w:type="default" r:id="rId9"/>
           <w:footerReference w:type="default" r:id="rId10"/>
           <w:pgSz w:w="11906" w:h="16838"/>
-          <w:pgMar w:top="794" w:right="624" w:bottom="737" w:left="624" w:header="283" w:footer="283" w:gutter="0"/>
+          <w:pgMar w:top="794" w:right="624" w:bottom="737" w:left="624" w:header="397" w:footer="397" w:gutter="0"/>
           <w:cols w:space="340" w:num="2"/>
           <w:docGrid w:linePitch="360"/>
           <w:bidi/>
@@ -4170,7 +4170,7 @@
           <w:footerReference w:type="default" r:id="rId12"/>
           <w:type w:val="continuous"/>
           <w:pgSz w:w="11906" w:h="16838"/>
-          <w:pgMar w:top="794" w:right="624" w:bottom="737" w:left="624" w:header="283" w:footer="283" w:gutter="0"/>
+          <w:pgMar w:top="794" w:right="624" w:bottom="737" w:left="624" w:header="397" w:footer="397" w:gutter="0"/>
           <w:cols w:space="340" w:num="2"/>
           <w:docGrid w:linePitch="360"/>
           <w:bidi/>
@@ -9317,7 +9317,7 @@
           <w:footerReference w:type="default" r:id="rId14"/>
           <w:type w:val="continuous"/>
           <w:pgSz w:w="11906" w:h="16838"/>
-          <w:pgMar w:top="794" w:right="624" w:bottom="737" w:left="624" w:header="283" w:footer="283" w:gutter="0"/>
+          <w:pgMar w:top="794" w:right="624" w:bottom="737" w:left="624" w:header="397" w:footer="397" w:gutter="0"/>
           <w:cols w:space="340" w:num="2"/>
           <w:docGrid w:linePitch="360"/>
           <w:bidi/>
@@ -11488,7 +11488,7 @@
           <w:footerReference w:type="default" r:id="rId16"/>
           <w:type w:val="continuous"/>
           <w:pgSz w:w="11906" w:h="16838"/>
-          <w:pgMar w:top="794" w:right="624" w:bottom="737" w:left="624" w:header="283" w:footer="283" w:gutter="0"/>
+          <w:pgMar w:top="794" w:right="624" w:bottom="737" w:left="624" w:header="397" w:footer="397" w:gutter="0"/>
           <w:cols w:space="340" w:num="2"/>
           <w:docGrid w:linePitch="360"/>
           <w:bidi/>
@@ -14970,7 +14970,7 @@
           <w:footerReference w:type="default" r:id="rId18"/>
           <w:type w:val="continuous"/>
           <w:pgSz w:w="11906" w:h="16838"/>
-          <w:pgMar w:top="794" w:right="624" w:bottom="737" w:left="624" w:header="283" w:footer="283" w:gutter="0"/>
+          <w:pgMar w:top="794" w:right="624" w:bottom="737" w:left="624" w:header="397" w:footer="397" w:gutter="0"/>
           <w:cols w:space="340" w:num="2"/>
           <w:docGrid w:linePitch="360"/>
           <w:bidi/>
@@ -17093,7 +17093,7 @@
           <w:footerReference w:type="default" r:id="rId20"/>
           <w:type w:val="continuous"/>
           <w:pgSz w:w="11906" w:h="16838"/>
-          <w:pgMar w:top="794" w:right="624" w:bottom="737" w:left="624" w:header="283" w:footer="283" w:gutter="0"/>
+          <w:pgMar w:top="794" w:right="624" w:bottom="737" w:left="624" w:header="397" w:footer="397" w:gutter="0"/>
           <w:cols w:space="340" w:num="2"/>
           <w:docGrid w:linePitch="360"/>
           <w:bidi/>
@@ -19314,7 +19314,7 @@
           <w:footerReference w:type="default" r:id="rId22"/>
           <w:type w:val="continuous"/>
           <w:pgSz w:w="11906" w:h="16838"/>
-          <w:pgMar w:top="794" w:right="624" w:bottom="737" w:left="624" w:header="283" w:footer="283" w:gutter="0"/>
+          <w:pgMar w:top="794" w:right="624" w:bottom="737" w:left="624" w:header="397" w:footer="397" w:gutter="0"/>
           <w:cols w:space="340" w:num="2"/>
           <w:docGrid w:linePitch="360"/>
           <w:bidi/>
@@ -21086,7 +21086,7 @@
           <w:footerReference w:type="default" r:id="rId24"/>
           <w:type w:val="continuous"/>
           <w:pgSz w:w="11906" w:h="16838"/>
-          <w:pgMar w:top="794" w:right="624" w:bottom="737" w:left="624" w:header="283" w:footer="283" w:gutter="0"/>
+          <w:pgMar w:top="794" w:right="624" w:bottom="737" w:left="624" w:header="397" w:footer="397" w:gutter="0"/>
           <w:cols w:space="340" w:num="2"/>
           <w:docGrid w:linePitch="360"/>
           <w:bidi/>
@@ -23400,7 +23400,7 @@
           <w:footerReference w:type="default" r:id="rId26"/>
           <w:type w:val="continuous"/>
           <w:pgSz w:w="11906" w:h="16838"/>
-          <w:pgMar w:top="794" w:right="624" w:bottom="737" w:left="624" w:header="283" w:footer="283" w:gutter="0"/>
+          <w:pgMar w:top="794" w:right="624" w:bottom="737" w:left="624" w:header="397" w:footer="397" w:gutter="0"/>
           <w:cols w:space="340" w:num="2"/>
           <w:docGrid w:linePitch="360"/>
           <w:bidi/>
@@ -25133,7 +25133,7 @@
           <w:footerReference w:type="default" r:id="rId28"/>
           <w:type w:val="continuous"/>
           <w:pgSz w:w="11906" w:h="16838"/>
-          <w:pgMar w:top="794" w:right="624" w:bottom="737" w:left="624" w:header="283" w:footer="283" w:gutter="0"/>
+          <w:pgMar w:top="794" w:right="624" w:bottom="737" w:left="624" w:header="397" w:footer="397" w:gutter="0"/>
           <w:cols w:space="340" w:num="2"/>
           <w:docGrid w:linePitch="360"/>
           <w:bidi/>
@@ -25186,7 +25186,7 @@
         <w:sectPr>
           <w:type w:val="continuous"/>
           <w:pgSz w:w="11906" w:h="16838"/>
-          <w:pgMar w:top="794" w:right="624" w:bottom="737" w:left="624" w:header="283" w:footer="283" w:gutter="0"/>
+          <w:pgMar w:top="794" w:right="624" w:bottom="737" w:left="624" w:header="397" w:footer="397" w:gutter="0"/>
           <w:cols w:space="170" w:num="1" w:equalWidth="1"/>
           <w:docGrid w:linePitch="360"/>
           <w:bidi/>
@@ -28991,7 +28991,7 @@
     <w:sectPr>
       <w:type w:val="continuous"/>
       <w:pgSz w:w="11906" w:h="16838"/>
-      <w:pgMar w:top="794" w:right="624" w:bottom="737" w:left="624" w:header="283" w:footer="283" w:gutter="0"/>
+      <w:pgMar w:top="794" w:right="624" w:bottom="737" w:left="624" w:header="397" w:footer="397" w:gutter="0"/>
       <w:cols w:space="170" w:num="5" w:equalWidth="1"/>
       <w:docGrid w:linePitch="360"/>
       <w:bidi/>
@@ -29897,7 +29897,7 @@
         <w:rtl/>
         <w:szCs w:val="17"/>
       </w:rPr>
-      <w:t>מנהיגות בניהול אנשים   יסודות וגישות קלאסיות</w:t>
+      <w:t>מנהיגות בניהול אנשים   יסודות וגישות קלאסיות   ת״ז: ________________</w:t>
     </w:r>
     <w:r>
       <w:pict>
@@ -29959,7 +29959,7 @@
         <w:rtl/>
         <w:szCs w:val="17"/>
       </w:rPr>
-      <w:t>מנהיגות בניהול אנשים   צוותים ויישום במקרים</w:t>
+      <w:t>מנהיגות בניהול אנשים   צוותים ויישום במקרים   ת״ז: ________________</w:t>
     </w:r>
     <w:r>
       <w:pict>
@@ -30021,7 +30021,7 @@
         <w:rtl/>
         <w:szCs w:val="17"/>
       </w:rPr>
-      <w:t>מנהיגות בניהול אנשים   אורגניות וגישות מודרניות</w:t>
+      <w:t>מנהיגות בניהול אנשים   אורגניות וגישות מודרניות   ת״ז: ________________</w:t>
     </w:r>
     <w:r>
       <w:pict>
@@ -30083,7 +30083,7 @@
         <w:rtl/>
         <w:szCs w:val="17"/>
       </w:rPr>
-      <w:t>מנהיגות בניהול אנשים   אדיג׳ס וסגנונות ניהול</w:t>
+      <w:t>מנהיגות בניהול אנשים   אדיג׳ס וסגנונות ניהול   ת״ז: ________________</w:t>
     </w:r>
     <w:r>
       <w:pict>
@@ -30145,7 +30145,7 @@
         <w:rtl/>
         <w:szCs w:val="17"/>
       </w:rPr>
-      <w:t>מנהיגות בניהול אנשים   מנהיגות כוח והשפעה</w:t>
+      <w:t>מנהיגות בניהול אנשים   מנהיגות כוח והשפעה   ת״ז: ________________</w:t>
     </w:r>
     <w:r>
       <w:pict>
@@ -30207,7 +30207,7 @@
         <w:rtl/>
         <w:szCs w:val="17"/>
       </w:rPr>
-      <w:t>מנהיגות בניהול אנשים   תכונות ואישיות</w:t>
+      <w:t>מנהיגות בניהול אנשים   תכונות ואישיות   ת״ז: ________________</w:t>
     </w:r>
     <w:r>
       <w:pict>
@@ -30269,7 +30269,7 @@
         <w:rtl/>
         <w:szCs w:val="17"/>
       </w:rPr>
-      <w:t>מנהיגות בניהול אנשים   הגישה ההתנהגותית</w:t>
+      <w:t>מנהיגות בניהול אנשים   הגישה ההתנהגותית   ת״ז: ________________</w:t>
     </w:r>
     <w:r>
       <w:pict>
@@ -30331,7 +30331,7 @@
         <w:rtl/>
         <w:szCs w:val="17"/>
       </w:rPr>
-      <w:t>מנהיגות בניהול אנשים   הגישה המצבית ופידלר</w:t>
+      <w:t>מנהיגות בניהול אנשים   הגישה המצבית ופידלר   ת״ז: ________________</w:t>
     </w:r>
     <w:r>
       <w:pict>
@@ -30393,7 +30393,7 @@
         <w:rtl/>
         <w:szCs w:val="17"/>
       </w:rPr>
-      <w:t>מנהיגות בניהול אנשים   הרסי ובלנשארד ודגשי המרצה</w:t>
+      <w:t>מנהיגות בניהול אנשים   הרסי ובלנשארד ודגשי המרצה   ת״ז: ________________</w:t>
     </w:r>
     <w:r>
       <w:pict>
@@ -30455,7 +30455,7 @@
         <w:rtl/>
         <w:szCs w:val="17"/>
       </w:rPr>
-      <w:t>מנהיגות בניהול אנשים   מודל הטווח המלא</w:t>
+      <w:t>מנהיגות בניהול אנשים   מודל הטווח המלא   ת״ז: ________________</w:t>
     </w:r>
     <w:r>
       <w:pict>

</xml_diff>

<commit_message>
Booklet: add ~20 details found missing in a lookup audit of all exam questions
Co-Authored-By: Claude Opus 5.5 <noreply@anthropic.com>
</commit_message>
<xml_diff>
--- a/חומר פתוח - מנהיגות בניהול.docx
+++ b/חומר פתוח - מנהיגות בניהול.docx
@@ -1131,6 +1131,17 @@
         </w:rPr>
         <w:t xml:space="preserve"> — חקר השפעת אנשים, קבוצות, מבנים ותהליכים על ההתנהגות בארגון, כדי לשפר אפקטיביות. מנהיגות נמצאת בתחום זה.</w:t>
       </w:r>
+      <w:r>
+        <w:rPr>
+          <w:rFonts w:ascii="Arial" w:hAnsi="Arial" w:cs="Arial"/>
+          <w:b w:val="0"/>
+          <w:color w:val="000000"/>
+          <w:sz w:val="22"/>
+          <w:rtl/>
+          <w:szCs w:val="22"/>
+        </w:rPr>
+        <w:t xml:space="preserve"> התחום ניזון מסוציולוגיה, פסיכולוגיה, כלכלה, אנתרופולוגיה (תרבות ארגונית ומחקרים בין־תרבותיים), מדע המדינה ותקשורת.</w:t>
+      </w:r>
     </w:p>
     <w:p>
       <w:pPr>
@@ -1208,6 +1219,17 @@
           <w:szCs w:val="22"/>
         </w:rPr>
         <w:t xml:space="preserve"> — תכנון, ארגון, הנהגה ובקרה של האנשים והמשימות לשם השגת מטרות הארגון. גישות ניהוליות מסייעות גם להתמודד עם אי־ודאות.</w:t>
+      </w:r>
+      <w:r>
+        <w:rPr>
+          <w:rFonts w:ascii="Arial" w:hAnsi="Arial" w:cs="Arial"/>
+          <w:b w:val="0"/>
+          <w:color w:val="000000"/>
+          <w:sz w:val="22"/>
+          <w:rtl/>
+          <w:szCs w:val="22"/>
+        </w:rPr>
+        <w:t xml:space="preserve"> גישות ניהוליות: צורת מחשבה, כלים ושיטות לניהול ארגונים למקסימום יעילות ואפקטיביות.</w:t>
       </w:r>
     </w:p>
     <w:p>
@@ -1639,6 +1661,17 @@
           <w:szCs w:val="22"/>
         </w:rPr>
         <w:t xml:space="preserve"> — הארגון מדומה למכונה שתוכננה להשגת מטרות. המוקד הוא יעילות באמצעות מבנים, נהלים, הליכים, פיקוח ובקרה.</w:t>
+      </w:r>
+      <w:r>
+        <w:rPr>
+          <w:rFonts w:ascii="Arial" w:hAnsi="Arial" w:cs="Arial"/>
+          <w:b w:val="0"/>
+          <w:color w:val="000000"/>
+          <w:sz w:val="22"/>
+          <w:rtl/>
+          <w:szCs w:val="22"/>
+        </w:rPr>
+        <w:t xml:space="preserve"> ניהול מכאניסטי־אינסטרומנטלי: האדם כלי עבודה, ותוצריו נמדדים מול קצב המכונה.</w:t>
       </w:r>
     </w:p>
     <w:p>
@@ -8399,7 +8432,7 @@
                 <w:rtl/>
                 <w:szCs w:val="19"/>
               </w:rPr>
-              <w:t xml:space="preserve"> · רעיון, מחויבות ומוצר; הארגון טרם נולד.</w:t>
+              <w:t xml:space="preserve"> · רעיון, כסף ומשוגע לדבר; מחויבות למוצר, לא לשוק; הארגון טרם נולד.</w:t>
             </w:r>
           </w:p>
         </w:tc>
@@ -9541,6 +9574,67 @@
         <w:t xml:space="preserve"> — קליין והאוס: ניצוץ הוא המנהיג, חומר הגלם המונהגים והחמצן הנסיבות. התופעה תלויה באינטראקציה של שלושתם.</w:t>
       </w:r>
     </w:p>
+    <w:p>
+      <w:pPr>
+        <w:bidi/>
+        <w:jc w:val="right"/>
+      </w:pPr>
+      <w:r>
+        <w:rPr>
+          <w:rFonts w:ascii="Arial" w:hAnsi="Arial" w:cs="Arial"/>
+          <w:b/>
+          <w:color w:val="000000"/>
+          <w:sz w:val="22"/>
+          <w:rtl/>
+          <w:szCs w:val="22"/>
+        </w:rPr>
+        <w:t xml:space="preserve">▪ </w:t>
+      </w:r>
+      <w:r>
+        <w:rPr>
+          <w:rFonts w:ascii="Arial" w:hAnsi="Arial" w:cs="Arial"/>
+          <w:b/>
+          <w:color w:val="000000"/>
+          <w:sz w:val="22"/>
+          <w:rtl/>
+          <w:szCs w:val="22"/>
+        </w:rPr>
+        <w:t>הגדרות וסיווג</w:t>
+      </w:r>
+      <w:r>
+        <w:rPr>
+          <w:rFonts w:ascii="Arial" w:hAnsi="Arial" w:cs="Arial"/>
+          <w:b w:val="0"/>
+          <w:color w:val="000000"/>
+          <w:sz w:val="22"/>
+          <w:rtl/>
+          <w:szCs w:val="22"/>
+        </w:rPr>
+        <w:t xml:space="preserve"> — ברנס, </w:t>
+      </w:r>
+      <w:r>
+        <w:rPr>
+          <w:rFonts w:ascii="Arial" w:hAnsi="Arial" w:cs="Arial"/>
+          <w:b w:val="0"/>
+          <w:color w:val="000000"/>
+          <w:sz w:val="22"/>
+          <w:rtl/>
+          <w:szCs w:val="22"/>
+        </w:rPr>
+        <w:t xml:space="preserve">‎1978‎</w:t>
+      </w:r>
+      <w:r>
+        <w:rPr>
+          <w:rFonts w:ascii="Arial" w:hAnsi="Arial" w:cs="Arial"/>
+          <w:b w:val="0"/>
+          <w:color w:val="000000"/>
+          <w:sz w:val="22"/>
+          <w:rtl/>
+          <w:szCs w:val="22"/>
+        </w:rPr>
+        <w:t xml:space="preserve">: מנהיגות היא מהתופעות הנצפות ביותר והבלתי מובנות ביותר. ההגדרות מסווגות: תכונות אישיות, מוקד של תהליכים חברתיים, צורת התנהגות, תהליך השפעה. ארבע הגישות: תכונות, התנהגותיות, מצבית, וכריזמה והטווח המלא. שלושה קריטריונים לסיווג התיאוריות: מנהיג מול מצב; מנהיג מול מונהגים; אוניברסלית מול תלות.</w:t>
+      </w:r>
+    </w:p>
     <w:tbl>
       <w:tblPr>
         <w:bidiVisual/>
@@ -15252,6 +15346,45 @@
     </w:p>
     <w:p>
       <w:pPr>
+        <w:bidi/>
+        <w:jc w:val="right"/>
+      </w:pPr>
+      <w:r>
+        <w:rPr>
+          <w:rFonts w:ascii="Arial" w:hAnsi="Arial" w:cs="Arial"/>
+          <w:b/>
+          <w:color w:val="000000"/>
+          <w:sz w:val="22"/>
+          <w:rtl/>
+          <w:szCs w:val="22"/>
+        </w:rPr>
+        <w:t xml:space="preserve">▪ </w:t>
+      </w:r>
+      <w:r>
+        <w:rPr>
+          <w:rFonts w:ascii="Arial" w:hAnsi="Arial" w:cs="Arial"/>
+          <w:b/>
+          <w:color w:val="000000"/>
+          <w:sz w:val="22"/>
+          <w:rtl/>
+          <w:szCs w:val="22"/>
+        </w:rPr>
+        <w:t>השלמה לגישת התכונות</w:t>
+      </w:r>
+      <w:r>
+        <w:rPr>
+          <w:rFonts w:ascii="Arial" w:hAnsi="Arial" w:cs="Arial"/>
+          <w:b w:val="0"/>
+          <w:color w:val="000000"/>
+          <w:sz w:val="22"/>
+          <w:rtl/>
+          <w:szCs w:val="22"/>
+        </w:rPr>
+        <w:t xml:space="preserve"> — תיאוריית האדם הדגול נשענת על הדרוויניזם: החזק שורד. ביקורת נוספת: בחברה דמוקרטית מנהיגים צומחים בכל מקום ובכל משפחה, ולכן המנהיגות אינה תורשתית.</w:t>
+      </w:r>
+    </w:p>
+    <w:p>
+      <w:pPr>
         <w:pStyle w:val="Heading2"/>
         <w:bidi/>
         <w:spacing w:before="100" w:after="60"/>
@@ -15955,6 +16088,45 @@
           <w:szCs w:val="22"/>
         </w:rPr>
         <w:t xml:space="preserve"> — מישיגן מוצג כרצף של שני קצוות; אוהיו מאפשר שילוב במידות שונות של שני הממדים.</w:t>
+      </w:r>
+    </w:p>
+    <w:p>
+      <w:pPr>
+        <w:bidi/>
+        <w:jc w:val="right"/>
+      </w:pPr>
+      <w:r>
+        <w:rPr>
+          <w:rFonts w:ascii="Arial" w:hAnsi="Arial" w:cs="Arial"/>
+          <w:b/>
+          <w:color w:val="000000"/>
+          <w:sz w:val="22"/>
+          <w:rtl/>
+          <w:szCs w:val="22"/>
+        </w:rPr>
+        <w:t xml:space="preserve">▪ </w:t>
+      </w:r>
+      <w:r>
+        <w:rPr>
+          <w:rFonts w:ascii="Arial" w:hAnsi="Arial" w:cs="Arial"/>
+          <w:b/>
+          <w:color w:val="000000"/>
+          <w:sz w:val="22"/>
+          <w:rtl/>
+          <w:szCs w:val="22"/>
+        </w:rPr>
+        <w:t>ניהול מובנה</w:t>
+      </w:r>
+      <w:r>
+        <w:rPr>
+          <w:rFonts w:ascii="Arial" w:hAnsi="Arial" w:cs="Arial"/>
+          <w:b w:val="0"/>
+          <w:color w:val="000000"/>
+          <w:sz w:val="22"/>
+          <w:rtl/>
+          <w:szCs w:val="22"/>
+        </w:rPr>
+        <w:t xml:space="preserve"> — כינוי לייזום מבנה גבוה: לוחות זמנים, ביצוע וביקורת, למשל בקו ייצור.</w:t>
       </w:r>
     </w:p>
     <w:p>
@@ -17355,6 +17527,17 @@
         </w:rPr>
         <w:t>.</w:t>
       </w:r>
+      <w:r>
+        <w:rPr>
+          <w:rFonts w:ascii="Arial" w:hAnsi="Arial" w:cs="Arial"/>
+          <w:b w:val="0"/>
+          <w:color w:val="000000"/>
+          <w:sz w:val="22"/>
+          <w:rtl/>
+          <w:szCs w:val="22"/>
+        </w:rPr>
+        <w:t xml:space="preserve"> המחקר עסק בזיהוי ובמיפוי של תנאי המצב שהצמיחו מנהיגים.</w:t>
+      </w:r>
     </w:p>
     <w:p>
       <w:pPr>
@@ -19062,6 +19245,17 @@
         </w:rPr>
         <w:t xml:space="preserve"> — מארגן, מתכנן, נותן עצות ומידע ומתרכז בהשלמת המשימה.</w:t>
       </w:r>
+      <w:r>
+        <w:rPr>
+          <w:rFonts w:ascii="Arial" w:hAnsi="Arial" w:cs="Arial"/>
+          <w:b w:val="0"/>
+          <w:color w:val="000000"/>
+          <w:sz w:val="22"/>
+          <w:rtl/>
+          <w:szCs w:val="22"/>
+        </w:rPr>
+        <w:t xml:space="preserve"> כהונתו זמנית, ופגה עם סיום המשימה.</w:t>
+      </w:r>
     </w:p>
     <w:p>
       <w:pPr>
@@ -19100,6 +19294,17 @@
           <w:szCs w:val="22"/>
         </w:rPr>
         <w:t xml:space="preserve"> — מעודד, מפייס, מגבש, מגן ומטפל בלכידות ובמורל.</w:t>
+      </w:r>
+      <w:r>
+        <w:rPr>
+          <w:rFonts w:ascii="Arial" w:hAnsi="Arial" w:cs="Arial"/>
+          <w:b w:val="0"/>
+          <w:color w:val="000000"/>
+          <w:sz w:val="22"/>
+          <w:rtl/>
+          <w:szCs w:val="22"/>
+        </w:rPr>
+        <w:t xml:space="preserve"> יכול להנהיג לאורך זמן.</w:t>
       </w:r>
     </w:p>
     <w:p>
@@ -19536,6 +19741,17 @@
           <w:szCs w:val="22"/>
         </w:rPr>
         <w:t xml:space="preserve"> — בשלות אינה תכונת אישיות קבועה. אותו עובד יכול להיות בשל למשימה אחת ופחות בשל למשימה אחרת; בשלות קבוצה אינה סכום בשלות חבריה.</w:t>
+      </w:r>
+      <w:r>
+        <w:rPr>
+          <w:rFonts w:ascii="Arial" w:hAnsi="Arial" w:cs="Arial"/>
+          <w:b w:val="0"/>
+          <w:color w:val="000000"/>
+          <w:sz w:val="22"/>
+          <w:rtl/>
+          <w:szCs w:val="22"/>
+        </w:rPr>
+        <w:t xml:space="preserve"> בגרות: מידת העצמאות, היכולת ליטול אחריות ומניע ההישג; קשורה בהשכלה, בגיל, בניסיון ובתרבות הארגונית.</w:t>
       </w:r>
     </w:p>
     <w:tbl>
@@ -20508,6 +20724,45 @@
           <w:rtl/>
           <w:szCs w:val="22"/>
         </w:rPr>
+        <w:t>החולשה המרכזית</w:t>
+      </w:r>
+      <w:r>
+        <w:rPr>
+          <w:rFonts w:ascii="Arial" w:hAnsi="Arial" w:cs="Arial"/>
+          <w:b w:val="0"/>
+          <w:color w:val="000000"/>
+          <w:sz w:val="22"/>
+          <w:rtl/>
+          <w:szCs w:val="22"/>
+        </w:rPr>
+        <w:t xml:space="preserve"> — הגישה טשטשה את ייחוד המנהיגות: אם הכול תלוי במצב, לא ברור במה ניכרת השפעת המנהיג. מכאן הכמיהה למנהיגות חזקה, והמעבר לטווח המלא.</w:t>
+      </w:r>
+    </w:p>
+    <w:p>
+      <w:pPr>
+        <w:bidi/>
+        <w:jc w:val="right"/>
+      </w:pPr>
+      <w:r>
+        <w:rPr>
+          <w:rFonts w:ascii="Arial" w:hAnsi="Arial" w:cs="Arial"/>
+          <w:b/>
+          <w:color w:val="000000"/>
+          <w:sz w:val="22"/>
+          <w:rtl/>
+          <w:szCs w:val="22"/>
+        </w:rPr>
+        <w:t xml:space="preserve">▪ </w:t>
+      </w:r>
+      <w:r>
+        <w:rPr>
+          <w:rFonts w:ascii="Arial" w:hAnsi="Arial" w:cs="Arial"/>
+          <w:b/>
+          <w:color w:val="000000"/>
+          <w:sz w:val="22"/>
+          <w:rtl/>
+          <w:szCs w:val="22"/>
+        </w:rPr>
         <w:t>השוואת המודלים</w:t>
       </w:r>
       <w:r>
@@ -20811,6 +21066,61 @@
           <w:szCs w:val="22"/>
         </w:rPr>
         <w:t xml:space="preserve">.</w:t>
+      </w:r>
+      <w:r>
+        <w:rPr>
+          <w:rFonts w:ascii="Arial" w:hAnsi="Arial" w:cs="Arial"/>
+          <w:b w:val="0"/>
+          <w:color w:val="000000"/>
+          <w:sz w:val="22"/>
+          <w:rtl/>
+          <w:szCs w:val="22"/>
+        </w:rPr>
+        <w:t xml:space="preserve"> עוד מהמצגת: </w:t>
+      </w:r>
+      <w:r>
+        <w:rPr>
+          <w:rFonts w:ascii="Arial" w:hAnsi="Arial" w:cs="Arial"/>
+          <w:b w:val="0"/>
+          <w:color w:val="000000"/>
+          <w:sz w:val="22"/>
+          <w:rtl/>
+          <w:szCs w:val="22"/>
+        </w:rPr>
+        <w:t xml:space="preserve">‎I‎</w:t>
+      </w:r>
+      <w:r>
+        <w:rPr>
+          <w:rFonts w:ascii="Arial" w:hAnsi="Arial" w:cs="Arial"/>
+          <w:b w:val="0"/>
+          <w:color w:val="000000"/>
+          <w:sz w:val="22"/>
+          <w:rtl/>
+          <w:szCs w:val="22"/>
+        </w:rPr>
+        <w:t xml:space="preserve"> נקרא גם מתכלל. בטבלה </w:t>
+      </w:r>
+      <w:r>
+        <w:rPr>
+          <w:rFonts w:ascii="Arial" w:hAnsi="Arial" w:cs="Arial"/>
+          <w:b w:val="0"/>
+          <w:color w:val="000000"/>
+          <w:sz w:val="22"/>
+          <w:rtl/>
+          <w:szCs w:val="22"/>
+        </w:rPr>
+        <w:t xml:space="preserve">‎E‎</w:t>
+      </w:r>
+      <w:r>
+        <w:rPr>
+          <w:rFonts w:ascii="Arial" w:hAnsi="Arial" w:cs="Arial"/>
+          <w:b w:val="0"/>
+          <w:color w:val="000000"/>
+          <w:sz w:val="22"/>
+          <w:rtl/>
+          <w:szCs w:val="22"/>
+        </w:rPr>
+        <w:t xml:space="preserve"> מסומן גם באנשים וגם במשימה: אפקטיבי, לטווח ארוך. לנהל את המנהל: לזהות אילו דפוסים חסרים לו ולסייע לו בהם.</w:t>
       </w:r>
     </w:p>
     <w:p>
@@ -21248,6 +21558,17 @@
         </w:rPr>
         <w:t xml:space="preserve"> — אי־מנהיגות; מנהיגות מתגמלת; מנהיגות מעצבת. יש לזהות התנהגות לפי התרחיש, ולא רק לפי תואר התפקיד.</w:t>
       </w:r>
+      <w:r>
+        <w:rPr>
+          <w:rFonts w:ascii="Arial" w:hAnsi="Arial" w:cs="Arial"/>
+          <w:b w:val="0"/>
+          <w:color w:val="000000"/>
+          <w:sz w:val="22"/>
+          <w:rtl/>
+          <w:szCs w:val="22"/>
+        </w:rPr>
+        <w:t xml:space="preserve"> המתגמלת מכונה מקלות וגזרים.</w:t>
+      </w:r>
     </w:p>
     <w:p>
       <w:pPr>
@@ -21286,6 +21607,45 @@
           <w:szCs w:val="22"/>
         </w:rPr>
         <w:t xml:space="preserve"> — במצגת החזרה למבחן אי־המנהיגות נקראת מנהיגות לסה פייר, והמנהיגות המתגמלת נקראת מנהיגות עיסקתית. בגישה ההתנהגותית לסה פייר הוא הדפוס הלא מתערב.</w:t>
+      </w:r>
+    </w:p>
+    <w:p>
+      <w:pPr>
+        <w:bidi/>
+        <w:jc w:val="right"/>
+      </w:pPr>
+      <w:r>
+        <w:rPr>
+          <w:rFonts w:ascii="Arial" w:hAnsi="Arial" w:cs="Arial"/>
+          <w:b/>
+          <w:color w:val="000000"/>
+          <w:sz w:val="22"/>
+          <w:rtl/>
+          <w:szCs w:val="22"/>
+        </w:rPr>
+        <w:t xml:space="preserve">▪ </w:t>
+      </w:r>
+      <w:r>
+        <w:rPr>
+          <w:rFonts w:ascii="Arial" w:hAnsi="Arial" w:cs="Arial"/>
+          <w:b/>
+          <w:color w:val="000000"/>
+          <w:sz w:val="22"/>
+          <w:rtl/>
+          <w:szCs w:val="22"/>
+        </w:rPr>
+        <w:t>האפקטיבי ביותר</w:t>
+      </w:r>
+      <w:r>
+        <w:rPr>
+          <w:rFonts w:ascii="Arial" w:hAnsi="Arial" w:cs="Arial"/>
+          <w:b w:val="0"/>
+          <w:color w:val="000000"/>
+          <w:sz w:val="22"/>
+          <w:rtl/>
+          <w:szCs w:val="22"/>
+        </w:rPr>
+        <w:t xml:space="preserve"> — המנהיגות המעצבת. בתרשים המודל היא בקצה האפקטיבי והאקטיבי, ואי־המנהיגות בקצה הלא אפקטיבי והפסיבי. ככל שמאמצים דפוסים מעצבים, המנהיגות אפקטיבית יותר.</w:t>
       </w:r>
     </w:p>
     <w:p>
@@ -22568,6 +22928,17 @@
           <w:szCs w:val="22"/>
         </w:rPr>
         <w:t xml:space="preserve"> — חזון, משמעות והתלהבות מצביעים על השראה. בדיקת הנחות, חלופה חדשה וזווית אחרת על בעיה מצביעות על אתגור.</w:t>
+      </w:r>
+      <w:r>
+        <w:rPr>
+          <w:rFonts w:ascii="Arial" w:hAnsi="Arial" w:cs="Arial"/>
+          <w:b w:val="0"/>
+          <w:color w:val="000000"/>
+          <w:sz w:val="22"/>
+          <w:rtl/>
+          <w:szCs w:val="22"/>
+        </w:rPr>
+        <w:t xml:space="preserve"> מעוררים השראה בשיחה רציונלית, בהברקה או ביופי שבהצגת טיעון.</w:t>
       </w:r>
     </w:p>
     <w:p>

</xml_diff>